<commit_message>
fix: Move detail pages back to pages/, fix all broken links, 116/116 tests pass
- Moved 29 detail pages from pages/_detail/ back to pages/ (Streamlit
  doesn't support page_link to subdirectories)
- Fixed all pages/_detail/ references to pages/ across 8 files
- Fixed broken link: 13_Client_Presentation.py → 13_Document_Hub.py
- Added full_system_test.py — comprehensive 116-point test suite
- ALL tests pass: syntax (82), imports (11), links (0 broken),
  config (46/46), database (15 tables), calculations (21/21),
  documents (DOCX+PPTX+XLSX+PDF), drawings (162), APIs (3/3),
  self-healing (100%), agro (6 crops), presenter (15 slides + AI copilot)

Co-Authored-By: Claude Opus 4.6 (1M context) <noreply@anthropic.com>
</commit_message>
<xml_diff>
--- a/data/auto_synced/Bank_Proposal_30MT_Uttar_Pradesh.docx
+++ b/data/auto_synced/Bank_Proposal_30MT_Uttar_Pradesh.docx
@@ -237,7 +237,7 @@
           </w:tcPr>
           <w:p>
             <w:r>
-              <w:t>2.01x (Bank minimum: 1.50x)</w:t>
+              <w:t>1.93x (Bank minimum: 1.50x)</w:t>
             </w:r>
           </w:p>
         </w:tc>
@@ -311,7 +311,7 @@
           </w:tcPr>
           <w:p>
             <w:r>
-              <w:t>Rs 1273 Lakhs</w:t>
+              <w:t>Rs 1232 Lakhs</w:t>
             </w:r>
           </w:p>
         </w:tc>
@@ -333,7 +333,7 @@
           </w:tcPr>
           <w:p>
             <w:r>
-              <w:t>21.9%</w:t>
+              <w:t>20.7%</w:t>
             </w:r>
           </w:p>
         </w:tc>
@@ -355,7 +355,7 @@
           </w:tcPr>
           <w:p>
             <w:r>
-              <w:t>34.3%</w:t>
+              <w:t>32.2%</w:t>
             </w:r>
           </w:p>
         </w:tc>
@@ -377,7 +377,7 @@
           </w:tcPr>
           <w:p>
             <w:r>
-              <w:t>52 months</w:t>
+              <w:t>54 months</w:t>
             </w:r>
           </w:p>
         </w:tc>

</xml_diff>